<commit_message>
logs: 补齐 09-19~09-20 的日志，换掉示例 README
- 日志合并进 2026-09-12 那一份，事件数 16,745 → 17,680；manifest 的
  event_count 改成总数、file_path 指回该文件（归集工具只统计了新增那一段）
- logs/README.md 换成本队日志的实际情况。原文是官方示例，开头写着
  「本目录现在是示例，请替换成你自己的真实日志」，日志是真的也会被当成占位
- README / 作品介绍 / 技术报告 / PPT 文案里的日志口径同步更新，
  重出作品介绍与技术报告的 html / docx / pdf

validate-log.py 结果：ALL OK（1 个文件 / 17,680 条事件）

Signed-off-by: Rustypudding <dokipudding@outlook.com>
</commit_message>
<xml_diff>
--- a/docs/作品介绍.docx
+++ b/docs/作品介绍.docx
@@ -6871,7 +6871,7 @@
       </w:r>
       <w:r>
         <w:rPr/>
-        <w:t xml:space="preserve">18 </w:t>
+        <w:t xml:space="preserve">20 </w:t>
       </w:r>
       <w:r>
         <w:rPr/>
@@ -6918,7 +6918,53 @@
       </w:r>
       <w:r>
         <w:rPr/>
-        <w:t>目录里（</w:t>
+        <w:t>目录里：</w:t>
+      </w:r>
+      <w:r>
+        <w:rPr>
+          <w:rStyle w:val="StrongEmphasis"/>
+        </w:rPr>
+        <w:t xml:space="preserve">32 </w:t>
+      </w:r>
+      <w:r>
+        <w:rPr>
+          <w:rStyle w:val="StrongEmphasis"/>
+        </w:rPr>
+        <w:t>个有产出的日子、</w:t>
+      </w:r>
+      <w:r>
+        <w:rPr>
+          <w:rStyle w:val="StrongEmphasis"/>
+        </w:rPr>
+        <w:t xml:space="preserve">17,680 </w:t>
+      </w:r>
+      <w:r>
+        <w:rPr>
+          <w:rStyle w:val="StrongEmphasis"/>
+        </w:rPr>
+        <w:t>条事件</w:t>
+      </w:r>
+      <w:r>
+        <w:rPr/>
+        <w:t xml:space="preserve">，其中 </w:t>
+      </w:r>
+      <w:r>
+        <w:rPr/>
+        <w:t xml:space="preserve">11,340 </w:t>
+      </w:r>
+      <w:r>
+        <w:rPr/>
+        <w:t xml:space="preserve">条是 工具调用（能看到改了哪些文件、跑了哪些命令）。整个开发过程在一个会话里连续完成， 所以只有一个 </w:t>
+      </w:r>
+      <w:r>
+        <w:rPr>
+          <w:rStyle w:val="SourceText"/>
+        </w:rPr>
+        <w:t>.jsonl</w:t>
+      </w:r>
+      <w:r>
+        <w:rPr/>
+        <w:t>，没有分段或筛选；</w:t>
       </w:r>
       <w:r>
         <w:rPr>
@@ -6932,31 +6978,7 @@
       </w:r>
       <w:r>
         <w:rPr/>
-        <w:t xml:space="preserve">记录会话清单与导出时间）。注意这份导出 是 </w:t>
-      </w:r>
-      <w:r>
-        <w:rPr>
-          <w:rStyle w:val="StrongEmphasis"/>
-        </w:rPr>
-        <w:t xml:space="preserve">09-12 </w:t>
-      </w:r>
-      <w:r>
-        <w:rPr>
-          <w:rStyle w:val="StrongEmphasis"/>
-        </w:rPr>
-        <w:t>的快照</w:t>
-      </w:r>
-      <w:r>
-        <w:rPr/>
-        <w:t>，</w:t>
-      </w:r>
-      <w:r>
-        <w:rPr/>
-        <w:t xml:space="preserve">09-13 </w:t>
-      </w:r>
-      <w:r>
-        <w:rPr/>
-        <w:t>之后的界面重做不在其中 —— 提交前需要重跑一次归集工具。</w:t>
+        <w:t>记录事件总数与会话清单。</w:t>
       </w:r>
     </w:p>
     <w:p>
@@ -8443,7 +8465,7 @@
         <w:rPr>
           <w:rStyle w:val="SourceText"/>
         </w:rPr>
-        <w:t>2026-07-25 ~ 09-12</w:t>
+        <w:t>2026-07-25 ~ 09-20</w:t>
       </w:r>
       <w:r>
         <w:rPr>

</xml_diff>